<commit_message>
NIW docs: embed official CDC 2024 obesity prevalence map (memo Fig 3, briefing)
</commit_message>
<xml_diff>
--- a/docs/niw/Forkcast_EB2NIW_Prong1_Memo_v2.docx
+++ b/docs/niw/Forkcast_EB2NIW_Prong1_Memo_v2.docx
@@ -1386,6 +1386,58 @@
       <w:r>
         <w:drawing>
           <wp:inline xmlns:a="http://schemas.openxmlformats.org/drawingml/2006/main" xmlns:pic="http://schemas.openxmlformats.org/drawingml/2006/picture">
+            <wp:extent cx="5760720" cy="4104513"/>
+            <wp:docPr id="5" name="Picture 5"/>
+            <wp:cNvGraphicFramePr>
+              <a:graphicFrameLocks noChangeAspect="1"/>
+            </wp:cNvGraphicFramePr>
+            <a:graphic>
+              <a:graphicData uri="http://schemas.openxmlformats.org/drawingml/2006/picture">
+                <pic:pic>
+                  <pic:nvPicPr>
+                    <pic:cNvPr id="0" name="cdc_map_2024_overall.png"/>
+                    <pic:cNvPicPr/>
+                  </pic:nvPicPr>
+                  <pic:blipFill>
+                    <a:blip r:embed="rId12"/>
+                    <a:stretch>
+                      <a:fillRect/>
+                    </a:stretch>
+                  </pic:blipFill>
+                  <pic:spPr>
+                    <a:xfrm>
+                      <a:off x="0" y="0"/>
+                      <a:ext cx="5760720" cy="4104513"/>
+                    </a:xfrm>
+                    <a:prstGeom prst="rect"/>
+                  </pic:spPr>
+                </pic:pic>
+              </a:graphicData>
+            </a:graphic>
+          </wp:inline>
+        </w:drawing>
+      </w:r>
+    </w:p>
+    <w:p>
+      <w:pPr>
+        <w:jc w:val="center"/>
+      </w:pPr>
+      <w:r>
+        <w:rPr>
+          <w:i/>
+          <w:color w:val="605D5D"/>
+          <w:sz w:val="17"/>
+        </w:rPr>
+        <w:t>Figure 3. Official CDC map: self-reported adult obesity prevalence by state and territory, 2024 BRFSS. In 2024, at least 1 in 4 adults in every U.S. state and territory had obesity; 19 states had prevalence at or above 35%, and Mississippi, West Virginia, and Guam were at or above 40% (Tennessee: insufficient data). Source: Centers for Disease Control and Prevention, Adult Obesity Prevalence Maps, published December 3, 2025.</w:t>
+      </w:r>
+    </w:p>
+    <w:p>
+      <w:pPr>
+        <w:jc w:val="center"/>
+      </w:pPr>
+      <w:r>
+        <w:drawing>
+          <wp:inline xmlns:a="http://schemas.openxmlformats.org/drawingml/2006/main" xmlns:pic="http://schemas.openxmlformats.org/drawingml/2006/picture">
             <wp:extent cx="5760720" cy="2160270"/>
             <wp:docPr id="3" name="Picture 3"/>
             <wp:cNvGraphicFramePr>
@@ -1428,7 +1480,7 @@
           <w:color w:val="605D5D"/>
           <w:sz w:val="17"/>
         </w:rPr>
-        <w:t>Figure 3. The expansion roadmap in federal data: adult obesity prevalence by census region and by prevalence band, 2024 BRFSS (CDC Adult Obesity Prevalence Maps, published Dec. 3, 2025).</w:t>
+        <w:t>Figure 4. The expansion roadmap in federal data: adult obesity prevalence by census region and by prevalence band, 2024 BRFSS (CDC Adult Obesity Prevalence Maps, published Dec. 3, 2025).</w:t>
       </w:r>
     </w:p>
     <w:p>
@@ -1486,7 +1538,7 @@
           <w:color w:val="605D5D"/>
           <w:sz w:val="17"/>
         </w:rPr>
-        <w:t>Figure 4. The intervention gap: the away-from-home channel dominates U.S. diets while the existing policy instrument produces a ~24 kcal/order effect (USDA ERS; peer-reviewed labeling literature).</w:t>
+        <w:t>Figure 5. The intervention gap: the away-from-home channel dominates U.S. diets while the existing policy instrument produces a ~24 kcal/order effect (USDA ERS; peer-reviewed labeling literature).</w:t>
       </w:r>
     </w:p>
     <w:p>

</xml_diff>